<commit_message>
Fold 0.14.0 into OPTIMIZATION: the clip's numbers and the county nobody built
Section 4.1 gains what the clip actually did - GNIS strays from 66.5 km to
0.3 km, OpenAddresses from 9.8 km, nothing beyond the buffer but streets -
and the residual it leaves at a land border, which is the same defect reduced
rather than removed.

Section 4.5 is new: the county suffix, found by writing up the next four
regions instead of by building one. Cheapest defect in the document.

All four builds rebuilt on 0.14.0 and re-measured: 96.0%, 95.5%, 92.4%,
91.9%, which is 2,154 cases with zero changed outcomes in either direction.

Co-Authored-By: Claude Opus 5 (1M context) <noreply@anthropic.com>
</commit_message>
<xml_diff>
--- a/docs/OPTIMIZATION.docx
+++ b/docs/OPTIMIZATION.docx
@@ -534,7 +534,7 @@
               <w:pStyle w:val="Compact"/>
             </w:pPr>
             <w:r>
-              <w:t xml:space="preserve">2,516, none foreign, none beyond 16 km</w:t>
+              <w:t xml:space="preserve">none beyond the 300 m buffer but streets</w:t>
             </w:r>
           </w:p>
         </w:tc>
@@ -574,6 +574,45 @@
                 <w:bCs/>
               </w:rPr>
               <w:t xml:space="preserve">1</w:t>
+            </w:r>
+          </w:p>
+        </w:tc>
+      </w:tr>
+      <w:tr>
+        <w:tc>
+          <w:tcPr/>
+          <w:p>
+            <w:pPr>
+              <w:pStyle w:val="Compact"/>
+            </w:pPr>
+            <w:r>
+              <w:t xml:space="preserve">Two builds at once against one database</w:t>
+            </w:r>
+          </w:p>
+        </w:tc>
+        <w:tc>
+          <w:tcPr/>
+          <w:p>
+            <w:pPr>
+              <w:pStyle w:val="Compact"/>
+            </w:pPr>
+            <w:r>
+              <w:t xml:space="preserve">silent corruption</w:t>
+            </w:r>
+          </w:p>
+        </w:tc>
+        <w:tc>
+          <w:tcPr/>
+          <w:p>
+            <w:pPr>
+              <w:pStyle w:val="Compact"/>
+            </w:pPr>
+            <w:r>
+              <w:rPr>
+                <w:b/>
+                <w:bCs/>
+              </w:rPr>
+              <w:t xml:space="preserve">refused</w:t>
             </w:r>
           </w:p>
         </w:tc>
@@ -2079,7 +2118,7 @@
       </w:r>
     </w:p>
     <w:bookmarkEnd w:id="13"/>
-    <w:bookmarkStart w:id="18" w:name="correctness-found-on-the-way"/>
+    <w:bookmarkStart w:id="19" w:name="correctness-found-on-the-way"/>
     <w:p>
       <w:pPr>
         <w:pStyle w:val="Heading2"/>
@@ -2208,7 +2247,7 @@
         <w:pStyle w:val="BodyText"/>
       </w:pPr>
       <w:r>
-        <w:t xml:space="preserve">That reasoning was checked afterwards and is wrong at the edges. A state’s own GNIS file includes</w:t>
+        <w:t xml:space="preserve">That reasoning was checked afterwards and was wrong at the edges. A state’s own GNIS file includes</w:t>
       </w:r>
       <w:r>
         <w:t xml:space="preserve"> </w:t>
@@ -2220,25 +2259,19 @@
         <w:t xml:space="preserve"> </w:t>
       </w:r>
       <w:r>
-        <w:t xml:space="preserve">admits a similar margin. Measured across the four builds, between 1,689 and 3,322 features sit</w:t>
-      </w:r>
-      <w:r>
-        <w:t xml:space="preserve"> </w:t>
-      </w:r>
-      <w:r>
-        <w:t xml:space="preserve">outside the region - and in a single-state build the fallback that fills in a missing county</w:t>
-      </w:r>
-      <w:r>
-        <w:t xml:space="preserve"> </w:t>
-      </w:r>
-      <w:r>
-        <w:t xml:space="preserve">labels every one of them with the build’s state, which is the defect this section describes,</w:t>
-      </w:r>
-      <w:r>
-        <w:t xml:space="preserve"> </w:t>
-      </w:r>
-      <w:r>
-        <w:t xml:space="preserve">returning at a twentieth of its old size. New York holds</w:t>
+        <w:t xml:space="preserve">admits a similar margin - up to 66 km of it, in Utah, New Mexico and Sonora. In a single-state</w:t>
+      </w:r>
+      <w:r>
+        <w:t xml:space="preserve"> </w:t>
+      </w:r>
+      <w:r>
+        <w:t xml:space="preserve">build the fallback that fills in a missing county then labelled every one of them with the</w:t>
+      </w:r>
+      <w:r>
+        <w:t xml:space="preserve"> </w:t>
+      </w:r>
+      <w:r>
+        <w:t xml:space="preserve">build’s state, so New York answered</w:t>
       </w:r>
       <w:r>
         <w:t xml:space="preserve"> </w:t>
@@ -2253,22 +2286,336 @@
         <w:t xml:space="preserve"> </w:t>
       </w:r>
       <w:r>
-        <w:t xml:space="preserve">for a river in</w:t>
-      </w:r>
-      <w:r>
-        <w:t xml:space="preserve"> </w:t>
-      </w:r>
-      <w:r>
-        <w:t xml:space="preserve">New Jersey, and Canadian parts of the Akwesasne reserve. The numbers, the distinction between</w:t>
-      </w:r>
-      <w:r>
-        <w:t xml:space="preserve"> </w:t>
-      </w:r>
-      <w:r>
-        <w:t xml:space="preserve">single- and multi-state builds, and the fix are in</w:t>
-      </w:r>
-      <w:r>
-        <w:t xml:space="preserve"> </w:t>
+        <w:t xml:space="preserve">for a river in New Jersey.</w:t>
+      </w:r>
+    </w:p>
+    <w:p>
+      <w:pPr>
+        <w:pStyle w:val="BodyText"/>
+      </w:pPr>
+      <w:r>
+        <w:t xml:space="preserve">The clip now runs over every point source rather than OpenStreetMap alone, built once in the</w:t>
+      </w:r>
+      <w:r>
+        <w:t xml:space="preserve"> </w:t>
+      </w:r>
+      <w:r>
+        <w:t xml:space="preserve">staging step so it applies whether or not OpenStreetMap is loaded:</w:t>
+      </w:r>
+    </w:p>
+    <w:tbl>
+      <w:tblPr>
+        <w:tblStyle w:val="Table"/>
+        <w:tblW w:type="auto" w:w="0"/>
+        <w:tblLook w:firstRow="1" w:lastRow="0" w:firstColumn="0" w:lastColumn="0" w:noHBand="0" w:noVBand="0" w:val="0020"/>
+      </w:tblPr>
+      <w:tblGrid>
+        <w:gridCol w:w="2640"/>
+        <w:gridCol w:w="2640"/>
+        <w:gridCol w:w="2640"/>
+      </w:tblGrid>
+      <w:tr>
+        <w:trPr>
+          <w:tblHeader w:val="on"/>
+        </w:trPr>
+        <w:tc>
+          <w:tcPr/>
+          <w:p>
+            <w:pPr>
+              <w:pStyle w:val="Compact"/>
+            </w:pPr>
+            <w:r>
+              <w:t xml:space="preserve">Source</w:t>
+            </w:r>
+          </w:p>
+        </w:tc>
+        <w:tc>
+          <w:tcPr/>
+          <w:p>
+            <w:pPr>
+              <w:pStyle w:val="Compact"/>
+            </w:pPr>
+            <w:r>
+              <w:t xml:space="preserve">Furthest stray before</w:t>
+            </w:r>
+          </w:p>
+        </w:tc>
+        <w:tc>
+          <w:tcPr/>
+          <w:p>
+            <w:pPr>
+              <w:pStyle w:val="Compact"/>
+            </w:pPr>
+            <w:r>
+              <w:t xml:space="preserve">After</w:t>
+            </w:r>
+          </w:p>
+        </w:tc>
+      </w:tr>
+      <w:tr>
+        <w:tc>
+          <w:tcPr/>
+          <w:p>
+            <w:pPr>
+              <w:pStyle w:val="Compact"/>
+            </w:pPr>
+            <w:r>
+              <w:t xml:space="preserve">GNIS</w:t>
+            </w:r>
+          </w:p>
+        </w:tc>
+        <w:tc>
+          <w:tcPr/>
+          <w:p>
+            <w:pPr>
+              <w:pStyle w:val="Compact"/>
+            </w:pPr>
+            <w:r>
+              <w:t xml:space="preserve">66.5 km</w:t>
+            </w:r>
+          </w:p>
+        </w:tc>
+        <w:tc>
+          <w:tcPr/>
+          <w:p>
+            <w:pPr>
+              <w:pStyle w:val="Compact"/>
+            </w:pPr>
+            <w:r>
+              <w:rPr>
+                <w:b/>
+                <w:bCs/>
+              </w:rPr>
+              <w:t xml:space="preserve">0.3 km</w:t>
+            </w:r>
+          </w:p>
+        </w:tc>
+      </w:tr>
+      <w:tr>
+        <w:tc>
+          <w:tcPr/>
+          <w:p>
+            <w:pPr>
+              <w:pStyle w:val="Compact"/>
+            </w:pPr>
+            <w:r>
+              <w:t xml:space="preserve">OpenAddresses</w:t>
+            </w:r>
+          </w:p>
+        </w:tc>
+        <w:tc>
+          <w:tcPr/>
+          <w:p>
+            <w:pPr>
+              <w:pStyle w:val="Compact"/>
+            </w:pPr>
+            <w:r>
+              <w:t xml:space="preserve">9.8 km</w:t>
+            </w:r>
+          </w:p>
+        </w:tc>
+        <w:tc>
+          <w:tcPr/>
+          <w:p>
+            <w:pPr>
+              <w:pStyle w:val="Compact"/>
+            </w:pPr>
+            <w:r>
+              <w:rPr>
+                <w:b/>
+                <w:bCs/>
+              </w:rPr>
+              <w:t xml:space="preserve">0.3 km</w:t>
+            </w:r>
+          </w:p>
+        </w:tc>
+      </w:tr>
+      <w:tr>
+        <w:tc>
+          <w:tcPr/>
+          <w:p>
+            <w:pPr>
+              <w:pStyle w:val="Compact"/>
+            </w:pPr>
+            <w:r>
+              <w:t xml:space="preserve">Overture</w:t>
+            </w:r>
+          </w:p>
+        </w:tc>
+        <w:tc>
+          <w:tcPr/>
+          <w:p>
+            <w:pPr>
+              <w:pStyle w:val="Compact"/>
+            </w:pPr>
+            <w:r>
+              <w:t xml:space="preserve">0.3 km</w:t>
+            </w:r>
+          </w:p>
+        </w:tc>
+        <w:tc>
+          <w:tcPr/>
+          <w:p>
+            <w:pPr>
+              <w:pStyle w:val="Compact"/>
+            </w:pPr>
+            <w:r>
+              <w:t xml:space="preserve">0.3 km</w:t>
+            </w:r>
+          </w:p>
+        </w:tc>
+      </w:tr>
+      <w:tr>
+        <w:tc>
+          <w:tcPr/>
+          <w:p>
+            <w:pPr>
+              <w:pStyle w:val="Compact"/>
+            </w:pPr>
+            <w:r>
+              <w:t xml:space="preserve">OpenStreetMap streets</w:t>
+            </w:r>
+          </w:p>
+        </w:tc>
+        <w:tc>
+          <w:tcPr/>
+          <w:p>
+            <w:pPr>
+              <w:pStyle w:val="Compact"/>
+            </w:pPr>
+            <w:r>
+              <w:t xml:space="preserve">17.2 km</w:t>
+            </w:r>
+          </w:p>
+        </w:tc>
+        <w:tc>
+          <w:tcPr/>
+          <w:p>
+            <w:pPr>
+              <w:pStyle w:val="Compact"/>
+            </w:pPr>
+            <w:r>
+              <w:t xml:space="preserve">17.2 km, kept on purpose</w:t>
+            </w:r>
+          </w:p>
+        </w:tc>
+      </w:tr>
+    </w:tbl>
+    <w:p>
+      <w:pPr>
+        <w:pStyle w:val="BodyText"/>
+      </w:pPr>
+      <w:r>
+        <w:t xml:space="preserve">Beyond the buffer nothing survives but streets - 270 in New York, 276 in Arizona plus Nevada, all</w:t>
+      </w:r>
+      <w:r>
+        <w:t xml:space="preserve"> </w:t>
+      </w:r>
+      <w:r>
+        <w:t xml:space="preserve">of them streets - and that is the case worth keeping: a street crossing the line is kept whole,</w:t>
+      </w:r>
+      <w:r>
+        <w:t xml:space="preserve"> </w:t>
+      </w:r>
+      <w:r>
+        <w:t xml:space="preserve">and its representative point is the centroid of the whole thing. All four accuracy sets are</w:t>
+      </w:r>
+      <w:r>
+        <w:t xml:space="preserve"> </w:t>
+      </w:r>
+      <w:r>
+        <w:t xml:space="preserve">unchanged to the case across 2,154 cases, which is what removing wrong data should look like.</w:t>
+      </w:r>
+    </w:p>
+    <w:p>
+      <w:pPr>
+        <w:pStyle w:val="BodyText"/>
+      </w:pPr>
+      <w:r>
+        <w:t xml:space="preserve">ZCTAs are deliberately exempt. A ZCTA belongs to the state holding most of its land area, not the</w:t>
+      </w:r>
+      <w:r>
+        <w:t xml:space="preserve"> </w:t>
+      </w:r>
+      <w:r>
+        <w:t xml:space="preserve">state holding its internal point, and that is the rule section 2.1 argues for: Maine owns 03579</w:t>
+      </w:r>
+      <w:r>
+        <w:t xml:space="preserve"> </w:t>
+      </w:r>
+      <w:r>
+        <w:t xml:space="preserve">on 846 km² against New Hampshire’s 611. Clipping them by point would undo it.</w:t>
+      </w:r>
+    </w:p>
+    <w:p>
+      <w:pPr>
+        <w:pStyle w:val="BodyText"/>
+      </w:pPr>
+      <w:r>
+        <w:t xml:space="preserve">What is left is the buffer itself, and it is honest to name it. The clip is the region buffered by</w:t>
+      </w:r>
+      <w:r>
+        <w:t xml:space="preserve"> </w:t>
+      </w:r>
+      <w:r>
+        <w:t xml:space="preserve">about 300 m, because an unbuffered clip drops piers and island shoreline. At a coast that is</w:t>
+      </w:r>
+      <w:r>
+        <w:t xml:space="preserve"> </w:t>
+      </w:r>
+      <w:r>
+        <w:t xml:space="preserve">right; at an international land border it admits a strip of the other country. New York still</w:t>
+      </w:r>
+      <w:r>
+        <w:t xml:space="preserve"> </w:t>
+      </w:r>
+      <w:r>
+        <w:t xml:space="preserve">holds</w:t>
+      </w:r>
+      <w:r>
+        <w:t xml:space="preserve"> </w:t>
+      </w:r>
+      <w:r>
+        <w:rPr>
+          <w:rStyle w:val="VerbatimChar"/>
+        </w:rPr>
+        <w:t xml:space="preserve">Akwesasne Canada Post</w:t>
+      </w:r>
+      <w:r>
+        <w:t xml:space="preserve"> </w:t>
+      </w:r>
+      <w:r>
+        <w:t xml:space="preserve">77 m outside the polygon, labelled</w:t>
+      </w:r>
+      <w:r>
+        <w:t xml:space="preserve"> </w:t>
+      </w:r>
+      <w:r>
+        <w:rPr>
+          <w:rStyle w:val="VerbatimChar"/>
+        </w:rPr>
+        <w:t xml:space="preserve">, NY, USA</w:t>
+      </w:r>
+      <w:r>
+        <w:t xml:space="preserve">, on a Mohawk</w:t>
+      </w:r>
+      <w:r>
+        <w:t xml:space="preserve"> </w:t>
+      </w:r>
+      <w:r>
+        <w:t xml:space="preserve">territory the border runs through - the defect of this section reduced from 118 km to 300 m</w:t>
+      </w:r>
+      <w:r>
+        <w:t xml:space="preserve"> </w:t>
+      </w:r>
+      <w:r>
+        <w:t xml:space="preserve">rather than removed. Subtracting Canada and Mexico from the buffer would fix it and needs their</w:t>
+      </w:r>
+      <w:r>
+        <w:t xml:space="preserve"> </w:t>
+      </w:r>
+      <w:r>
+        <w:t xml:space="preserve">polygons, which the US-only Who’s on First distribution does not carry (</w:t>
       </w:r>
       <w:r>
         <w:rPr>
@@ -2280,7 +2627,7 @@
         <w:t xml:space="preserve"> </w:t>
       </w:r>
       <w:r>
-        <w:t xml:space="preserve">section 10.</w:t>
+        <w:t xml:space="preserve">section 15).</w:t>
       </w:r>
     </w:p>
     <w:p>
@@ -2577,8 +2924,378 @@
       </w:r>
     </w:p>
     <w:bookmarkEnd w:id="17"/>
+    <w:bookmarkStart w:id="18" w:name="not-every-county-is-called-a-county"/>
+    <w:p>
+      <w:pPr>
+        <w:pStyle w:val="Heading3"/>
+      </w:pPr>
+      <w:r>
+        <w:t xml:space="preserve">4.5 Not every county is called a county</w:t>
+      </w:r>
+    </w:p>
+    <w:p>
+      <w:pPr>
+        <w:pStyle w:val="FirstParagraph"/>
+      </w:pPr>
+      <w:r>
+        <w:t xml:space="preserve">This one was found by writing documentation, which makes it the cheapest defect in this document</w:t>
+      </w:r>
+      <w:r>
+        <w:t xml:space="preserve"> </w:t>
+      </w:r>
+      <w:r>
+        <w:t xml:space="preserve">and the only one caught before the region that would have exposed it was built.</w:t>
+      </w:r>
+    </w:p>
+    <w:p>
+      <w:pPr>
+        <w:pStyle w:val="BodyText"/>
+      </w:pPr>
+      <w:r>
+        <w:t xml:space="preserve">Both front ends appended the word ” County” to every county name. The comment above the line read</w:t>
+      </w:r>
+      <w:r>
+        <w:t xml:space="preserve"> </w:t>
+      </w:r>
+      <w:r>
+        <w:t xml:space="preserve">“Pelias (WOF) names counties</w:t>
+      </w:r>
+      <w:r>
+        <w:t xml:space="preserve"> </w:t>
+      </w:r>
+      <w:r>
+        <w:t xml:space="preserve">‘Cumberland County’</w:t>
+      </w:r>
+      <w:r>
+        <w:t xml:space="preserve">”</w:t>
+      </w:r>
+      <w:r>
+        <w:t xml:space="preserve"> </w:t>
+      </w:r>
+      <w:r>
+        <w:t xml:space="preserve">- true of Maine, and of forty-odd other states.</w:t>
+      </w:r>
+      <w:r>
+        <w:t xml:space="preserve"> </w:t>
+      </w:r>
+      <w:r>
+        <w:t xml:space="preserve">It is not true of Louisiana, whose county equivalents are parishes; of Alaska, whose are boroughs,</w:t>
+      </w:r>
+      <w:r>
+        <w:t xml:space="preserve"> </w:t>
+      </w:r>
+      <w:r>
+        <w:t xml:space="preserve">municipalities and census areas; or of the District of Columbia, which is its own. Who’s on First</w:t>
+      </w:r>
+      <w:r>
+        <w:t xml:space="preserve"> </w:t>
+      </w:r>
+      <w:r>
+        <w:t xml:space="preserve">files all of them under placetype</w:t>
+      </w:r>
+      <w:r>
+        <w:t xml:space="preserve"> </w:t>
+      </w:r>
+      <w:r>
+        <w:rPr>
+          <w:rStyle w:val="VerbatimChar"/>
+        </w:rPr>
+        <w:t xml:space="preserve">county</w:t>
+      </w:r>
+      <w:r>
+        <w:t xml:space="preserve"> </w:t>
+      </w:r>
+      <w:r>
+        <w:t xml:space="preserve">with the bare name, so a Louisiana build would have</w:t>
+      </w:r>
+      <w:r>
+        <w:t xml:space="preserve"> </w:t>
+      </w:r>
+      <w:r>
+        <w:t xml:space="preserve">answered</w:t>
+      </w:r>
+      <w:r>
+        <w:t xml:space="preserve"> </w:t>
+      </w:r>
+      <w:r>
+        <w:rPr>
+          <w:rStyle w:val="VerbatimChar"/>
+        </w:rPr>
+        <w:t xml:space="preserve">Acadia County</w:t>
+      </w:r>
+      <w:r>
+        <w:t xml:space="preserve">, which is not a thing anyone has ever called it.</w:t>
+      </w:r>
+    </w:p>
+    <w:p>
+      <w:pPr>
+        <w:pStyle w:val="BodyText"/>
+      </w:pPr>
+      <w:r>
+        <w:t xml:space="preserve">The suffixed form was in the data the whole time, in a property nothing read:</w:t>
+      </w:r>
+    </w:p>
+    <w:tbl>
+      <w:tblPr>
+        <w:tblStyle w:val="Table"/>
+        <w:tblW w:type="auto" w:w="0"/>
+        <w:tblLook w:firstRow="1" w:lastRow="0" w:firstColumn="0" w:lastColumn="0" w:noHBand="0" w:noVBand="0" w:val="0020"/>
+      </w:tblPr>
+      <w:tblGrid>
+        <w:gridCol w:w="2640"/>
+        <w:gridCol w:w="2640"/>
+        <w:gridCol w:w="2640"/>
+      </w:tblGrid>
+      <w:tr>
+        <w:trPr>
+          <w:tblHeader w:val="on"/>
+        </w:trPr>
+        <w:tc>
+          <w:tcPr/>
+          <w:p>
+            <w:pPr>
+              <w:pStyle w:val="Compact"/>
+            </w:pPr>
+            <w:r>
+              <w:t xml:space="preserve">State</w:t>
+            </w:r>
+          </w:p>
+        </w:tc>
+        <w:tc>
+          <w:tcPr/>
+          <w:p>
+            <w:pPr>
+              <w:pStyle w:val="Compact"/>
+            </w:pPr>
+            <w:r>
+              <w:rPr>
+                <w:rStyle w:val="VerbatimChar"/>
+              </w:rPr>
+              <w:t xml:space="preserve">name</w:t>
+            </w:r>
+          </w:p>
+        </w:tc>
+        <w:tc>
+          <w:tcPr/>
+          <w:p>
+            <w:pPr>
+              <w:pStyle w:val="Compact"/>
+            </w:pPr>
+            <w:r>
+              <w:rPr>
+                <w:rStyle w:val="VerbatimChar"/>
+              </w:rPr>
+              <w:t xml:space="preserve">label:eng_x_preferred_longname</w:t>
+            </w:r>
+          </w:p>
+        </w:tc>
+      </w:tr>
+      <w:tr>
+        <w:tc>
+          <w:tcPr/>
+          <w:p>
+            <w:pPr>
+              <w:pStyle w:val="Compact"/>
+            </w:pPr>
+            <w:r>
+              <w:t xml:space="preserve">Texas</w:t>
+            </w:r>
+          </w:p>
+        </w:tc>
+        <w:tc>
+          <w:tcPr/>
+          <w:p>
+            <w:pPr>
+              <w:pStyle w:val="Compact"/>
+            </w:pPr>
+            <w:r>
+              <w:t xml:space="preserve">Anderson</w:t>
+            </w:r>
+          </w:p>
+        </w:tc>
+        <w:tc>
+          <w:tcPr/>
+          <w:p>
+            <w:pPr>
+              <w:pStyle w:val="Compact"/>
+            </w:pPr>
+            <w:r>
+              <w:t xml:space="preserve">Anderson</w:t>
+            </w:r>
+            <w:r>
+              <w:t xml:space="preserve"> </w:t>
+            </w:r>
+            <w:r>
+              <w:rPr>
+                <w:b/>
+                <w:bCs/>
+              </w:rPr>
+              <w:t xml:space="preserve">County</w:t>
+            </w:r>
+          </w:p>
+        </w:tc>
+      </w:tr>
+      <w:tr>
+        <w:tc>
+          <w:tcPr/>
+          <w:p>
+            <w:pPr>
+              <w:pStyle w:val="Compact"/>
+            </w:pPr>
+            <w:r>
+              <w:t xml:space="preserve">Louisiana</w:t>
+            </w:r>
+          </w:p>
+        </w:tc>
+        <w:tc>
+          <w:tcPr/>
+          <w:p>
+            <w:pPr>
+              <w:pStyle w:val="Compact"/>
+            </w:pPr>
+            <w:r>
+              <w:t xml:space="preserve">Acadia</w:t>
+            </w:r>
+          </w:p>
+        </w:tc>
+        <w:tc>
+          <w:tcPr/>
+          <w:p>
+            <w:pPr>
+              <w:pStyle w:val="Compact"/>
+            </w:pPr>
+            <w:r>
+              <w:t xml:space="preserve">Acadia</w:t>
+            </w:r>
+            <w:r>
+              <w:t xml:space="preserve"> </w:t>
+            </w:r>
+            <w:r>
+              <w:rPr>
+                <w:b/>
+                <w:bCs/>
+              </w:rPr>
+              <w:t xml:space="preserve">Parish</w:t>
+            </w:r>
+          </w:p>
+        </w:tc>
+      </w:tr>
+      <w:tr>
+        <w:tc>
+          <w:tcPr/>
+          <w:p>
+            <w:pPr>
+              <w:pStyle w:val="Compact"/>
+            </w:pPr>
+            <w:r>
+              <w:t xml:space="preserve">District of Columbia</w:t>
+            </w:r>
+          </w:p>
+        </w:tc>
+        <w:tc>
+          <w:tcPr/>
+          <w:p>
+            <w:pPr>
+              <w:pStyle w:val="Compact"/>
+            </w:pPr>
+            <w:r>
+              <w:t xml:space="preserve">District of Columbia</w:t>
+            </w:r>
+          </w:p>
+        </w:tc>
+        <w:tc>
+          <w:tcPr/>
+          <w:p>
+            <w:pPr>
+              <w:pStyle w:val="Compact"/>
+            </w:pPr>
+            <w:r>
+              <w:t xml:space="preserve">District of Columbia</w:t>
+            </w:r>
+          </w:p>
+        </w:tc>
+      </w:tr>
+    </w:tbl>
+    <w:p>
+      <w:pPr>
+        <w:pStyle w:val="BodyText"/>
+      </w:pPr>
+      <w:r>
+        <w:t xml:space="preserve">It now travels through</w:t>
+      </w:r>
+      <w:r>
+        <w:t xml:space="preserve"> </w:t>
+      </w:r>
+      <w:r>
+        <w:rPr>
+          <w:rStyle w:val="VerbatimChar"/>
+        </w:rPr>
+        <w:t xml:space="preserve">admin.longname</w:t>
+      </w:r>
+      <w:r>
+        <w:t xml:space="preserve"> </w:t>
+      </w:r>
+      <w:r>
+        <w:t xml:space="preserve">into the feature, and neither front end appends anything.</w:t>
+      </w:r>
+      <w:r>
+        <w:t xml:space="preserve"> </w:t>
+      </w:r>
+      <w:r>
+        <w:t xml:space="preserve">Maine still answers</w:t>
+      </w:r>
+      <w:r>
+        <w:t xml:space="preserve"> </w:t>
+      </w:r>
+      <w:r>
+        <w:rPr>
+          <w:rStyle w:val="VerbatimChar"/>
+        </w:rPr>
+        <w:t xml:space="preserve">Cumberland County</w:t>
+      </w:r>
+      <w:r>
+        <w:t xml:space="preserve"> </w:t>
+      </w:r>
+      <w:r>
+        <w:t xml:space="preserve">on both paths, so nothing about Pelias compatibility</w:t>
+      </w:r>
+      <w:r>
+        <w:t xml:space="preserve"> </w:t>
+      </w:r>
+      <w:r>
+        <w:t xml:space="preserve">changes; Louisiana will answer</w:t>
+      </w:r>
+      <w:r>
+        <w:t xml:space="preserve"> </w:t>
+      </w:r>
+      <w:r>
+        <w:rPr>
+          <w:rStyle w:val="VerbatimChar"/>
+        </w:rPr>
+        <w:t xml:space="preserve">Acadia Parish</w:t>
+      </w:r>
+      <w:r>
+        <w:t xml:space="preserve"> </w:t>
+      </w:r>
+      <w:r>
+        <w:t xml:space="preserve">when it is built. The same assumption had been</w:t>
+      </w:r>
+      <w:r>
+        <w:t xml:space="preserve"> </w:t>
+      </w:r>
+      <w:r>
+        <w:t xml:space="preserve">written twice, once in Python and once in SQL, which by this point in the document is the</w:t>
+      </w:r>
+      <w:r>
+        <w:t xml:space="preserve"> </w:t>
+      </w:r>
+      <w:r>
+        <w:t xml:space="preserve">expected shape of a defect rather than a surprise.</w:t>
+      </w:r>
+    </w:p>
     <w:bookmarkEnd w:id="18"/>
-    <w:bookmarkStart w:id="23" w:name="accuracy"/>
+    <w:bookmarkEnd w:id="19"/>
+    <w:bookmarkStart w:id="24" w:name="accuracy"/>
     <w:p>
       <w:pPr>
         <w:pStyle w:val="Heading2"/>
@@ -3177,7 +3894,7 @@
         <w:t xml:space="preserve">is now four points rather than eleven. No setting in the engine names a region.</w:t>
       </w:r>
     </w:p>
-    <w:bookmarkStart w:id="19" w:name="X1f989613f895fb414b10ef1b323a41bec867cc0"/>
+    <w:bookmarkStart w:id="20" w:name="X1f989613f895fb414b10ef1b323a41bec867cc0"/>
     <w:p>
       <w:pPr>
         <w:pStyle w:val="Heading3"/>
@@ -3882,8 +4599,8 @@
         <w:t xml:space="preserve">for any query.</w:t>
       </w:r>
     </w:p>
-    <w:bookmarkEnd w:id="19"/>
-    <w:bookmarkStart w:id="20" w:name="maine-was-not-disturbed"/>
+    <w:bookmarkEnd w:id="20"/>
+    <w:bookmarkStart w:id="21" w:name="maine-was-not-disturbed"/>
     <w:p>
       <w:pPr>
         <w:pStyle w:val="Heading3"/>
@@ -4201,8 +4918,8 @@
         <w:t xml:space="preserve">kilometre of street. The build now answers with the point 20 of them agree on.</w:t>
       </w:r>
     </w:p>
-    <w:bookmarkEnd w:id="20"/>
-    <w:bookmarkStart w:id="21" w:name="Xca707957f57c892c4a79d366dd4f672a8cf590b"/>
+    <w:bookmarkEnd w:id="21"/>
+    <w:bookmarkStart w:id="22" w:name="Xca707957f57c892c4a79d366dd4f672a8cf590b"/>
     <w:p>
       <w:pPr>
         <w:pStyle w:val="Heading3"/>
@@ -4886,8 +5603,8 @@
         <w:t xml:space="preserve">happened when the test was sharpened enough to see it.</w:t>
       </w:r>
     </w:p>
-    <w:bookmarkEnd w:id="21"/>
-    <w:bookmarkStart w:id="22" w:name="Xb052a3c4ef431302b8a4a3d1ffb183026eab472"/>
+    <w:bookmarkEnd w:id="22"/>
+    <w:bookmarkStart w:id="23" w:name="Xb052a3c4ef431302b8a4a3d1ffb183026eab472"/>
     <w:p>
       <w:pPr>
         <w:pStyle w:val="Heading3"/>
@@ -5705,9 +6422,9 @@
         <w:t xml:space="preserve">case set is the measure, and being confident about one of its cases is not a reason to edit it.</w:t>
       </w:r>
     </w:p>
-    <w:bookmarkEnd w:id="22"/>
     <w:bookmarkEnd w:id="23"/>
-    <w:bookmarkStart w:id="24" w:name="multi-state-builds"/>
+    <w:bookmarkEnd w:id="24"/>
+    <w:bookmarkStart w:id="25" w:name="multi-state-builds"/>
     <w:p>
       <w:pPr>
         <w:pStyle w:val="Heading2"/>
@@ -6382,8 +7099,8 @@
         <w:t xml:space="preserve">section 11).</w:t>
       </w:r>
     </w:p>
-    <w:bookmarkEnd w:id="24"/>
-    <w:bookmarkStart w:id="25" w:name="corner-cases-across-the-fifty-states"/>
+    <w:bookmarkEnd w:id="25"/>
+    <w:bookmarkStart w:id="26" w:name="corner-cases-across-the-fifty-states"/>
     <w:p>
       <w:pPr>
         <w:pStyle w:val="Heading2"/>
@@ -6739,8 +7456,8 @@
         <w:t xml:space="preserve">accept anything. Handling it means carrying two boxes through every step.</w:t>
       </w:r>
     </w:p>
-    <w:bookmarkEnd w:id="25"/>
-    <w:bookmarkStart w:id="26" w:name="resource-requirements"/>
+    <w:bookmarkEnd w:id="26"/>
+    <w:bookmarkStart w:id="27" w:name="resource-requirements"/>
     <w:p>
       <w:pPr>
         <w:pStyle w:val="Heading2"/>
@@ -7110,8 +7827,8 @@
         <w:t xml:space="preserve">carries the full table.</w:t>
       </w:r>
     </w:p>
-    <w:bookmarkEnd w:id="26"/>
-    <w:bookmarkStart w:id="27" w:name="what-this-means-for-the-study-report"/>
+    <w:bookmarkEnd w:id="27"/>
+    <w:bookmarkStart w:id="28" w:name="what-this-means-for-the-study-report"/>
     <w:p>
       <w:pPr>
         <w:pStyle w:val="Heading2"/>
@@ -7238,8 +7955,8 @@
         <w:t xml:space="preserve">rule adds, 4,088 addresses the duplicate clustering recovers, less what the clip removes.</w:t>
       </w:r>
     </w:p>
-    <w:bookmarkEnd w:id="27"/>
-    <w:bookmarkStart w:id="28" w:name="what-is-not-done"/>
+    <w:bookmarkEnd w:id="28"/>
+    <w:bookmarkStart w:id="29" w:name="what-is-not-done"/>
     <w:p>
       <w:pPr>
         <w:pStyle w:val="Heading2"/>
@@ -7574,7 +8291,7 @@
         <w:t xml:space="preserve">, so its capacity is unknown.</w:t>
       </w:r>
     </w:p>
-    <w:bookmarkEnd w:id="28"/>
+    <w:bookmarkEnd w:id="29"/>
     <w:sectPr>
       <w:footnotePr>
         <w:numRestart w:val="eachSect"/>

</xml_diff>

<commit_message>
Rebuild OPTIMIZATION with the border-clip results
Co-Authored-By: Claude Opus 5 (1M context) <noreply@anthropic.com>
</commit_message>
<xml_diff>
--- a/docs/OPTIMIZATION.docx
+++ b/docs/OPTIMIZATION.docx
@@ -2552,25 +2552,19 @@
         <w:pStyle w:val="BodyText"/>
       </w:pPr>
       <w:r>
-        <w:t xml:space="preserve">What is left is the buffer itself, and it is honest to name it. The clip is the region buffered by</w:t>
-      </w:r>
-      <w:r>
-        <w:t xml:space="preserve"> </w:t>
-      </w:r>
-      <w:r>
-        <w:t xml:space="preserve">about 300 m, because an unbuffered clip drops piers and island shoreline. At a coast that is</w:t>
-      </w:r>
-      <w:r>
-        <w:t xml:space="preserve"> </w:t>
-      </w:r>
-      <w:r>
-        <w:t xml:space="preserve">right; at an international land border it admits a strip of the other country. New York still</w:t>
-      </w:r>
-      <w:r>
-        <w:t xml:space="preserve"> </w:t>
-      </w:r>
-      <w:r>
-        <w:t xml:space="preserve">holds</w:t>
+        <w:t xml:space="preserve">That left the buffer itself. The clip is the region buffered by about 300 m, because an</w:t>
+      </w:r>
+      <w:r>
+        <w:t xml:space="preserve"> </w:t>
+      </w:r>
+      <w:r>
+        <w:t xml:space="preserve">unbuffered clip drops piers and island shoreline. At a coast that is right; at an international</w:t>
+      </w:r>
+      <w:r>
+        <w:t xml:space="preserve"> </w:t>
+      </w:r>
+      <w:r>
+        <w:t xml:space="preserve">land border it admitted a strip of the other country, and New York held</w:t>
       </w:r>
       <w:r>
         <w:t xml:space="preserve"> </w:t>
@@ -2585,7 +2579,7 @@
         <w:t xml:space="preserve"> </w:t>
       </w:r>
       <w:r>
-        <w:t xml:space="preserve">77 m outside the polygon, labelled</w:t>
+        <w:t xml:space="preserve">77 m outside the polygon labelled</w:t>
       </w:r>
       <w:r>
         <w:t xml:space="preserve"> </w:t>
@@ -2597,37 +2591,255 @@
         <w:t xml:space="preserve">, NY, USA</w:t>
       </w:r>
       <w:r>
-        <w:t xml:space="preserve">, on a Mohawk</w:t>
-      </w:r>
-      <w:r>
-        <w:t xml:space="preserve"> </w:t>
-      </w:r>
-      <w:r>
-        <w:t xml:space="preserve">territory the border runs through - the defect of this section reduced from 118 km to 300 m</w:t>
-      </w:r>
-      <w:r>
-        <w:t xml:space="preserve"> </w:t>
-      </w:r>
-      <w:r>
-        <w:t xml:space="preserve">rather than removed. Subtracting Canada and Mexico from the buffer would fix it and needs their</w:t>
-      </w:r>
-      <w:r>
-        <w:t xml:space="preserve"> </w:t>
-      </w:r>
-      <w:r>
-        <w:t xml:space="preserve">polygons, which the US-only Who’s on First distribution does not carry (</w:t>
+        <w:t xml:space="preserve">, on a Mohawk territory the border runs through -</w:t>
+      </w:r>
+      <w:r>
+        <w:t xml:space="preserve"> </w:t>
+      </w:r>
+      <w:r>
+        <w:t xml:space="preserve">the defect of this section reduced from 118 km to 300 m rather than removed.</w:t>
+      </w:r>
+    </w:p>
+    <w:p>
+      <w:pPr>
+        <w:pStyle w:val="BodyText"/>
+      </w:pPr>
+      <w:r>
+        <w:t xml:space="preserve">Canada and Mexico are now subtracted from the buffer, which leaves the seaward part untouched</w:t>
+      </w:r>
+      <w:r>
+        <w:t xml:space="preserve"> </w:t>
+      </w:r>
+      <w:r>
+        <w:t xml:space="preserve">because there is nothing out there to subtract. On Maine:</w:t>
+      </w:r>
+    </w:p>
+    <w:tbl>
+      <w:tblPr>
+        <w:tblStyle w:val="Table"/>
+        <w:tblW w:type="auto" w:w="0"/>
+        <w:tblLook w:firstRow="1" w:lastRow="0" w:firstColumn="0" w:lastColumn="0" w:noHBand="0" w:noVBand="0" w:val="0020"/>
+      </w:tblPr>
+      <w:tblGrid>
+        <w:gridCol w:w="2640"/>
+        <w:gridCol w:w="2640"/>
+        <w:gridCol w:w="2640"/>
+      </w:tblGrid>
+      <w:tr>
+        <w:trPr>
+          <w:tblHeader w:val="on"/>
+        </w:trPr>
+        <w:tc>
+          <w:tcPr/>
+          <w:p>
+            <w:pPr>
+              <w:pStyle w:val="Compact"/>
+            </w:pPr>
+          </w:p>
+        </w:tc>
+        <w:tc>
+          <w:tcPr/>
+          <w:p>
+            <w:pPr>
+              <w:pStyle w:val="Compact"/>
+            </w:pPr>
+            <w:r>
+              <w:t xml:space="preserve">Before</w:t>
+            </w:r>
+          </w:p>
+        </w:tc>
+        <w:tc>
+          <w:tcPr/>
+          <w:p>
+            <w:pPr>
+              <w:pStyle w:val="Compact"/>
+            </w:pPr>
+            <w:r>
+              <w:t xml:space="preserve">After</w:t>
+            </w:r>
+          </w:p>
+        </w:tc>
+      </w:tr>
+      <w:tr>
+        <w:tc>
+          <w:tcPr/>
+          <w:p>
+            <w:pPr>
+              <w:pStyle w:val="Compact"/>
+            </w:pPr>
+            <w:r>
+              <w:t xml:space="preserve">Features outside the state</w:t>
+            </w:r>
+          </w:p>
+        </w:tc>
+        <w:tc>
+          <w:tcPr/>
+          <w:p>
+            <w:pPr>
+              <w:pStyle w:val="Compact"/>
+            </w:pPr>
+            <w:r>
+              <w:t xml:space="preserve">2,492</w:t>
+            </w:r>
+          </w:p>
+        </w:tc>
+        <w:tc>
+          <w:tcPr/>
+          <w:p>
+            <w:pPr>
+              <w:pStyle w:val="Compact"/>
+            </w:pPr>
+            <w:r>
+              <w:rPr>
+                <w:b/>
+                <w:bCs/>
+              </w:rPr>
+              <w:t xml:space="preserve">235</w:t>
+            </w:r>
+          </w:p>
+        </w:tc>
+      </w:tr>
+      <w:tr>
+        <w:tc>
+          <w:tcPr/>
+          <w:p>
+            <w:pPr>
+              <w:pStyle w:val="Compact"/>
+            </w:pPr>
+            <w:r>
+              <w:t xml:space="preserve">Furthest</w:t>
+            </w:r>
+          </w:p>
+        </w:tc>
+        <w:tc>
+          <w:tcPr/>
+          <w:p>
+            <w:pPr>
+              <w:pStyle w:val="Compact"/>
+            </w:pPr>
+            <w:r>
+              <w:t xml:space="preserve">4.1 km</w:t>
+            </w:r>
+          </w:p>
+        </w:tc>
+        <w:tc>
+          <w:tcPr/>
+          <w:p>
+            <w:pPr>
+              <w:pStyle w:val="Compact"/>
+            </w:pPr>
+            <w:r>
+              <w:t xml:space="preserve">3.3 km, and all but 19 are streets</w:t>
+            </w:r>
+          </w:p>
+        </w:tc>
+      </w:tr>
+    </w:tbl>
+    <w:p>
+      <w:pPr>
+        <w:pStyle w:val="BodyText"/>
+      </w:pPr>
+      <w:r>
+        <w:t xml:space="preserve">The reason nothing inside the state is at risk is worth stating, because it is the kind of thing</w:t>
+      </w:r>
+      <w:r>
+        <w:t xml:space="preserve"> </w:t>
+      </w:r>
+      <w:r>
+        <w:t xml:space="preserve">that is usually assumed: the Who’s on First polygons for Maine and Canada meet at the border with</w:t>
+      </w:r>
+      <w:r>
+        <w:t xml:space="preserve"> </w:t>
+      </w:r>
+      <w:r>
+        <w:rPr>
+          <w:b/>
+          <w:bCs/>
+        </w:rPr>
+        <w:t xml:space="preserve">zero</w:t>
+      </w:r>
+      <w:r>
+        <w:t xml:space="preserve"> </w:t>
+      </w:r>
+      <w:r>
+        <w:t xml:space="preserve">overlapping area, measured. Maine’s accuracy is unchanged at 96.0% with no case altered</w:t>
+      </w:r>
+      <w:r>
+        <w:t xml:space="preserve"> </w:t>
+      </w:r>
+      <w:r>
+        <w:t xml:space="preserve">in either direction, and Peaks Island, Cliff Island, the Cranberry Isles, Isle au Haut and</w:t>
+      </w:r>
+      <w:r>
+        <w:t xml:space="preserve"> </w:t>
+      </w:r>
+      <w:r>
+        <w:t xml:space="preserve">Monhegan are all still there, which is what the buffer was for.</w:t>
+      </w:r>
+    </w:p>
+    <w:p>
+      <w:pPr>
+        <w:pStyle w:val="BodyText"/>
+      </w:pPr>
+      <w:r>
+        <w:t xml:space="preserve">The polygons cost 5.6 MB, as two single Who’s on First records rather than the</w:t>
+      </w:r>
+      <w:r>
+        <w:t xml:space="preserve"> </w:t>
       </w:r>
       <w:r>
         <w:rPr>
           <w:rStyle w:val="VerbatimChar"/>
         </w:rPr>
-        <w:t xml:space="preserve">TODO.md</w:t>
-      </w:r>
-      <w:r>
-        <w:t xml:space="preserve"> </w:t>
-      </w:r>
-      <w:r>
-        <w:t xml:space="preserve">section 15).</w:t>
+        <w:t xml:space="preserve">admin-ca</w:t>
+      </w:r>
+      <w:r>
+        <w:t xml:space="preserve"> </w:t>
+      </w:r>
+      <w:r>
+        <w:t xml:space="preserve">and</w:t>
+      </w:r>
+      <w:r>
+        <w:t xml:space="preserve"> </w:t>
+      </w:r>
+      <w:r>
+        <w:rPr>
+          <w:rStyle w:val="VerbatimChar"/>
+        </w:rPr>
+        <w:t xml:space="preserve">admin-mx</w:t>
+      </w:r>
+      <w:r>
+        <w:t xml:space="preserve"> </w:t>
+      </w:r>
+      <w:r>
+        <w:t xml:space="preserve">distributions at 176 MB and 230 MB compressed for two shapes. The fetch checks each</w:t>
+      </w:r>
+      <w:r>
+        <w:t xml:space="preserve"> </w:t>
+      </w:r>
+      <w:r>
+        <w:t xml:space="preserve">file’s</w:t>
+      </w:r>
+      <w:r>
+        <w:t xml:space="preserve"> </w:t>
+      </w:r>
+      <w:r>
+        <w:rPr>
+          <w:rStyle w:val="VerbatimChar"/>
+        </w:rPr>
+        <w:t xml:space="preserve">iso:country</w:t>
+      </w:r>
+      <w:r>
+        <w:t xml:space="preserve"> </w:t>
+      </w:r>
+      <w:r>
+        <w:t xml:space="preserve">afterwards, because the URL is built from an id and a wrong id returns a</w:t>
+      </w:r>
+      <w:r>
+        <w:t xml:space="preserve"> </w:t>
+      </w:r>
+      <w:r>
+        <w:t xml:space="preserve">perfectly valid polygon for somewhere else - 85633057 looks like Mexico’s and is Chile’s.</w:t>
       </w:r>
     </w:p>
     <w:p>

</xml_diff>

<commit_message>
OPTIMIZATION section 5.6, and close TODO 11
The report gains the contract test between the two front ends: why the
accuracy cases were not a sufficient corpus on their own, measured with a
deliberate negative control, and the parser bug it found on its first honest
run that five regions of accuracy testing had not.

Its one-line argument is worth having written down: a test of two
implementations against each other does not need to know the right answer, and
an accuracy set can only find what its ground truth covers. Five regions of
ground truth had not covered a town beginning "Ste".

Section 10 loses its lead entry, which this closes. Fifteen pages.

Thirteen done, three on hold, four open.

Co-Authored-By: Claude Opus 5 (1M context) <noreply@anthropic.com>
</commit_message>
<xml_diff>
--- a/docs/OPTIMIZATION.docx
+++ b/docs/OPTIMIZATION.docx
@@ -4134,7 +4134,7 @@
     </w:p>
     <w:bookmarkEnd w:id="18"/>
     <w:bookmarkEnd w:id="19"/>
-    <w:bookmarkStart w:id="25" w:name="accuracy"/>
+    <w:bookmarkStart w:id="26" w:name="accuracy"/>
     <w:p>
       <w:pPr>
         <w:pStyle w:val="Heading2"/>
@@ -7779,14 +7779,13 @@
       </w:r>
     </w:p>
     <w:bookmarkEnd w:id="24"/>
-    <w:bookmarkEnd w:id="25"/>
-    <w:bookmarkStart w:id="26" w:name="multi-state-builds"/>
-    <w:p>
-      <w:pPr>
-        <w:pStyle w:val="Heading2"/>
-      </w:pPr>
-      <w:r>
-        <w:t xml:space="preserve">6. Multi-state builds</w:t>
+    <w:bookmarkStart w:id="25" w:name="the-test-the-two-front-ends-needed"/>
+    <w:p>
+      <w:pPr>
+        <w:pStyle w:val="Heading3"/>
+      </w:pPr>
+      <w:r>
+        <w:t xml:space="preserve">5.6 The test the two front ends needed</w:t>
       </w:r>
     </w:p>
     <w:p>
@@ -7794,82 +7793,157 @@
         <w:pStyle w:val="FirstParagraph"/>
       </w:pPr>
       <w:r>
-        <w:t xml:space="preserve">A build may cover several states. Vermont plus New Hampshire was built through the documented</w:t>
-      </w:r>
-      <w:r>
-        <w:t xml:space="preserve"> </w:t>
-      </w:r>
-      <w:r>
-        <w:t xml:space="preserve">command, unattended: 1,074,744 raw features from two OpenStreetMap extracts appended into one</w:t>
-      </w:r>
-      <w:r>
-        <w:t xml:space="preserve"> </w:t>
-      </w:r>
-      <w:r>
-        <w:t xml:space="preserve">schema, 285,846 on the Vermont side and 121,554 on the New Hampshire side, and all sixteen known</w:t>
-      </w:r>
-      <w:r>
-        <w:t xml:space="preserve"> </w:t>
-      </w:r>
-      <w:r>
-        <w:t xml:space="preserve">answers passing on both front ends - including</w:t>
-      </w:r>
-      <w:r>
-        <w:t xml:space="preserve"> </w:t>
-      </w:r>
-      <w:r>
-        <w:t xml:space="preserve">“Burlington, Vermont”</w:t>
-      </w:r>
-      <w:r>
-        <w:t xml:space="preserve"> </w:t>
-      </w:r>
-      <w:r>
-        <w:t xml:space="preserve">giving</w:t>
-      </w:r>
-      <w:r>
-        <w:t xml:space="preserve"> </w:t>
-      </w:r>
+        <w:t xml:space="preserve">Two front ends answer the same API: FastAPI parses in Python and carries its parser in a container</w:t>
+      </w:r>
+      <w:r>
+        <w:t xml:space="preserve"> </w:t>
+      </w:r>
+      <w:r>
+        <w:t xml:space="preserve">image, the pure-SQL edge parses in PL/pgSQL and carries it in the database. They are separate</w:t>
+      </w:r>
+      <w:r>
+        <w:t xml:space="preserve"> </w:t>
+      </w:r>
+      <w:r>
+        <w:t xml:space="preserve">implementations of one contract, and over this work they drifted three times without anything</w:t>
+      </w:r>
+      <w:r>
+        <w:t xml:space="preserve"> </w:t>
+      </w:r>
+      <w:r>
+        <w:t xml:space="preserve">reporting it - a container left on an image older than the database, a parser fix applied to one</w:t>
+      </w:r>
+      <w:r>
+        <w:t xml:space="preserve"> </w:t>
+      </w:r>
+      <w:r>
+        <w:t xml:space="preserve">and not the other, and the same again a week later. Section 5.4’s known answers could not see it:</w:t>
+      </w:r>
+      <w:r>
+        <w:t xml:space="preserve"> </w:t>
+      </w:r>
+      <w:r>
+        <w:t xml:space="preserve">they compare a label as a substring, and both front ends were returning</w:t>
+      </w:r>
+      <w:r>
+        <w:t xml:space="preserve"> </w:t>
+      </w:r>
+      <w:r>
+        <w:rPr>
+          <w:i/>
+          <w:iCs/>
+        </w:rPr>
+        <w:t xml:space="preserve">something</w:t>
+      </w:r>
+      <w:r>
+        <w:t xml:space="preserve"> </w:t>
+      </w:r>
+      <w:r>
+        <w:t xml:space="preserve">containing</w:t>
+      </w:r>
+      <w:r>
+        <w:t xml:space="preserve"> </w:t>
+      </w:r>
+      <w:r>
+        <w:t xml:space="preserve">the right word.</w:t>
+      </w:r>
+    </w:p>
+    <w:p>
+      <w:pPr>
+        <w:pStyle w:val="BodyText"/>
+      </w:pPr>
       <w:r>
         <w:rPr>
           <w:rStyle w:val="VerbatimChar"/>
         </w:rPr>
-        <w:t xml:space="preserve">Burlington, VT, USA</w:t>
-      </w:r>
-      <w:r>
-        <w:t xml:space="preserve"> </w:t>
-      </w:r>
-      <w:r>
-        <w:t xml:space="preserve">and</w:t>
-      </w:r>
-      <w:r>
-        <w:t xml:space="preserve"> </w:t>
-      </w:r>
-      <w:r>
-        <w:t xml:space="preserve">“Concord, New Hampshire”</w:t>
-      </w:r>
-      <w:r>
-        <w:t xml:space="preserve"> </w:t>
-      </w:r>
-      <w:r>
-        <w:t xml:space="preserve">giving</w:t>
+        <w:t xml:space="preserve">pgeo-tune contract</w:t>
+      </w:r>
+      <w:r>
+        <w:t xml:space="preserve"> </w:t>
+      </w:r>
+      <w:r>
+        <w:t xml:space="preserve">asks both the same questions and fails on any disagreement, comparing the top</w:t>
+      </w:r>
+      <w:r>
+        <w:t xml:space="preserve"> </w:t>
+      </w:r>
+      <w:r>
+        <w:t xml:space="preserve">result’s gid - the identity of the answer rather than its presentation. Two empty answers agree,</w:t>
+      </w:r>
+      <w:r>
+        <w:t xml:space="preserve"> </w:t>
+      </w:r>
+      <w:r>
+        <w:t xml:space="preserve">because the contract is that they behave alike and not that they always find something. The</w:t>
+      </w:r>
+      <w:r>
+        <w:t xml:space="preserve"> </w:t>
+      </w:r>
+      <w:r>
+        <w:t xml:space="preserve">rebuild script runs it beside the known answers.</w:t>
+      </w:r>
+    </w:p>
+    <w:p>
+      <w:pPr>
+        <w:pStyle w:val="BodyText"/>
+      </w:pPr>
+      <w:r>
+        <w:t xml:space="preserve">The corpus took two attempts, and the first would have been worse than nothing. Sampling the</w:t>
+      </w:r>
+      <w:r>
+        <w:t xml:space="preserve"> </w:t>
+      </w:r>
+      <w:r>
+        <w:t xml:space="preserve">build’s accuracy cases looks obviously right, and it is not sufficient: with the state-aware typo</w:t>
+      </w:r>
+      <w:r>
+        <w:t xml:space="preserve"> </w:t>
+      </w:r>
+      <w:r>
+        <w:t xml:space="preserve">fallback deliberately removed from one front end, a 198-case sample of Texas plus Louisiana plus</w:t>
+      </w:r>
+      <w:r>
+        <w:t xml:space="preserve"> </w:t>
+      </w:r>
+      <w:r>
+        <w:t xml:space="preserve">Arkansas</w:t>
       </w:r>
       <w:r>
         <w:t xml:space="preserve"> </w:t>
       </w:r>
       <w:r>
         <w:rPr>
-          <w:rStyle w:val="VerbatimChar"/>
+          <w:b/>
+          <w:bCs/>
         </w:rPr>
-        <w:t xml:space="preserve">Concord, NH, USA</w:t>
-      </w:r>
-      <w:r>
-        <w:t xml:space="preserve">, which is the thing a multi-state build</w:t>
-      </w:r>
-      <w:r>
-        <w:t xml:space="preserve"> </w:t>
-      </w:r>
-      <w:r>
-        <w:t xml:space="preserve">has to get right and a check on the town name alone would not notice.</w:t>
+        <w:t xml:space="preserve">still reported agreement</w:t>
+      </w:r>
+      <w:r>
+        <w:t xml:space="preserve">. Only six of those cases pair a misspelling with a state and</w:t>
+      </w:r>
+      <w:r>
+        <w:t xml:space="preserve"> </w:t>
+      </w:r>
+      <w:r>
+        <w:t xml:space="preserve">all six are addresses that name the city too, so the path that had actually drifted was never</w:t>
+      </w:r>
+      <w:r>
+        <w:t xml:space="preserve"> </w:t>
+      </w:r>
+      <w:r>
+        <w:t xml:space="preserve">asked. The corpus is now those cases plus probes generated from the build’s own ambiguous towns -</w:t>
+      </w:r>
+      <w:r>
+        <w:t xml:space="preserve"> </w:t>
+      </w:r>
+      <w:r>
+        <w:t xml:space="preserve">each spelled correctly and with one transposition, with and without each state it belongs to -</w:t>
+      </w:r>
+      <w:r>
+        <w:t xml:space="preserve"> </w:t>
+      </w:r>
+      <w:r>
+        <w:t xml:space="preserve">and the same negative control is caught in nine queries.</w:t>
       </w:r>
     </w:p>
     <w:p>
@@ -7877,39 +7951,13 @@
         <w:pStyle w:val="BodyText"/>
       </w:pPr>
       <w:r>
-        <w:t xml:space="preserve">It found one defect the single-state builds could not: GNIS publishes a feature on a state line</w:t>
-      </w:r>
-      <w:r>
-        <w:t xml:space="preserve"> </w:t>
-      </w:r>
-      <w:r>
-        <w:t xml:space="preserve">in both states’ files with the same id, and Vermont and New Hampshire share 36 of them, all</w:t>
-      </w:r>
-      <w:r>
-        <w:t xml:space="preserve"> </w:t>
-      </w:r>
-      <w:r>
-        <w:t xml:space="preserve">brooks along the Connecticut River. The export validator refused the duplicate ids, which is how</w:t>
-      </w:r>
-      <w:r>
-        <w:t xml:space="preserve"> </w:t>
-      </w:r>
-      <w:r>
-        <w:t xml:space="preserve">it was found rather than shipped.</w:t>
-      </w:r>
-    </w:p>
-    <w:p>
-      <w:pPr>
-        <w:pStyle w:val="BodyText"/>
-      </w:pPr>
-      <w:r>
-        <w:t xml:space="preserve">Arizona plus Nevada was the second multi-state build and a much larger one, run start to finish</w:t>
-      </w:r>
-      <w:r>
-        <w:t xml:space="preserve"> </w:t>
-      </w:r>
-      <w:r>
-        <w:t xml:space="preserve">through the single documented command:</w:t>
+        <w:t xml:space="preserve">On its first honest run it found two things. Four of the five builds were serving an API image</w:t>
+      </w:r>
+      <w:r>
+        <w:t xml:space="preserve"> </w:t>
+      </w:r>
+      <w:r>
+        <w:t xml:space="preserve">older than their database. And a bug no case set had found in five regions:</w:t>
       </w:r>
     </w:p>
     <w:tbl>
@@ -7933,6 +7981,454 @@
             <w:pPr>
               <w:pStyle w:val="Compact"/>
             </w:pPr>
+            <w:r>
+              <w:t xml:space="preserve">Query</w:t>
+            </w:r>
+          </w:p>
+        </w:tc>
+        <w:tc>
+          <w:tcPr/>
+          <w:p>
+            <w:pPr>
+              <w:pStyle w:val="Compact"/>
+            </w:pPr>
+            <w:r>
+              <w:t xml:space="preserve">Python parser</w:t>
+            </w:r>
+          </w:p>
+        </w:tc>
+        <w:tc>
+          <w:tcPr/>
+          <w:p>
+            <w:pPr>
+              <w:pStyle w:val="Compact"/>
+            </w:pPr>
+            <w:r>
+              <w:t xml:space="preserve">should be</w:t>
+            </w:r>
+          </w:p>
+        </w:tc>
+      </w:tr>
+      <w:tr>
+        <w:tc>
+          <w:tcPr/>
+          <w:p>
+            <w:pPr>
+              <w:pStyle w:val="Compact"/>
+            </w:pPr>
+            <w:r>
+              <w:rPr>
+                <w:rStyle w:val="VerbatimChar"/>
+              </w:rPr>
+              <w:t xml:space="preserve">Stewart</w:t>
+            </w:r>
+          </w:p>
+        </w:tc>
+        <w:tc>
+          <w:tcPr/>
+          <w:p>
+            <w:pPr>
+              <w:pStyle w:val="Compact"/>
+            </w:pPr>
+            <w:r>
+              <w:rPr>
+                <w:i/>
+                <w:iCs/>
+              </w:rPr>
+              <w:t xml:space="preserve">deleted entirely</w:t>
+            </w:r>
+          </w:p>
+        </w:tc>
+        <w:tc>
+          <w:tcPr/>
+          <w:p>
+            <w:pPr>
+              <w:pStyle w:val="Compact"/>
+            </w:pPr>
+            <w:r>
+              <w:t xml:space="preserve">Stewart</w:t>
+            </w:r>
+          </w:p>
+        </w:tc>
+      </w:tr>
+      <w:tr>
+        <w:tc>
+          <w:tcPr/>
+          <w:p>
+            <w:pPr>
+              <w:pStyle w:val="Compact"/>
+            </w:pPr>
+            <w:r>
+              <w:rPr>
+                <w:rStyle w:val="VerbatimChar"/>
+              </w:rPr>
+              <w:t xml:space="preserve">Sterling Ave</w:t>
+            </w:r>
+          </w:p>
+        </w:tc>
+        <w:tc>
+          <w:tcPr/>
+          <w:p>
+            <w:pPr>
+              <w:pStyle w:val="Compact"/>
+            </w:pPr>
+            <w:r>
+              <w:rPr>
+                <w:rStyle w:val="VerbatimChar"/>
+              </w:rPr>
+              <w:t xml:space="preserve">Ave</w:t>
+            </w:r>
+          </w:p>
+        </w:tc>
+        <w:tc>
+          <w:tcPr/>
+          <w:p>
+            <w:pPr>
+              <w:pStyle w:val="Compact"/>
+            </w:pPr>
+            <w:r>
+              <w:t xml:space="preserve">Sterling Ave</w:t>
+            </w:r>
+          </w:p>
+        </w:tc>
+      </w:tr>
+      <w:tr>
+        <w:tc>
+          <w:tcPr/>
+          <w:p>
+            <w:pPr>
+              <w:pStyle w:val="Compact"/>
+            </w:pPr>
+            <w:r>
+              <w:rPr>
+                <w:rStyle w:val="VerbatimChar"/>
+              </w:rPr>
+              <w:t xml:space="preserve">Apthorp Ave</w:t>
+            </w:r>
+          </w:p>
+        </w:tc>
+        <w:tc>
+          <w:tcPr/>
+          <w:p>
+            <w:pPr>
+              <w:pStyle w:val="Compact"/>
+            </w:pPr>
+            <w:r>
+              <w:rPr>
+                <w:rStyle w:val="VerbatimChar"/>
+              </w:rPr>
+              <w:t xml:space="preserve">Ave</w:t>
+            </w:r>
+          </w:p>
+        </w:tc>
+        <w:tc>
+          <w:tcPr/>
+          <w:p>
+            <w:pPr>
+              <w:pStyle w:val="Compact"/>
+            </w:pPr>
+            <w:r>
+              <w:t xml:space="preserve">Apthorp Ave</w:t>
+            </w:r>
+          </w:p>
+        </w:tc>
+      </w:tr>
+      <w:tr>
+        <w:tc>
+          <w:tcPr/>
+          <w:p>
+            <w:pPr>
+              <w:pStyle w:val="Compact"/>
+            </w:pPr>
+            <w:r>
+              <w:rPr>
+                <w:rStyle w:val="VerbatimChar"/>
+              </w:rPr>
+              <w:t xml:space="preserve">#12</w:t>
+            </w:r>
+          </w:p>
+        </w:tc>
+        <w:tc>
+          <w:tcPr/>
+          <w:p>
+            <w:pPr>
+              <w:pStyle w:val="Compact"/>
+            </w:pPr>
+            <w:r>
+              <w:t xml:space="preserve">not matched</w:t>
+            </w:r>
+          </w:p>
+        </w:tc>
+        <w:tc>
+          <w:tcPr/>
+          <w:p>
+            <w:pPr>
+              <w:pStyle w:val="Compact"/>
+            </w:pPr>
+            <w:r>
+              <w:t xml:space="preserve">a unit</w:t>
+            </w:r>
+          </w:p>
+        </w:tc>
+      </w:tr>
+    </w:tbl>
+    <w:p>
+      <w:pPr>
+        <w:pStyle w:val="BodyText"/>
+      </w:pPr>
+      <w:r>
+        <w:t xml:space="preserve">The unit-designator pattern had a word boundary only at its start, so</w:t>
+      </w:r>
+      <w:r>
+        <w:t xml:space="preserve"> </w:t>
+      </w:r>
+      <w:r>
+        <w:t xml:space="preserve">“ste”</w:t>
+      </w:r>
+      <w:r>
+        <w:t xml:space="preserve"> </w:t>
+      </w:r>
+      <w:r>
+        <w:t xml:space="preserve">matched inside</w:t>
+      </w:r>
+      <w:r>
+        <w:t xml:space="preserve"> </w:t>
+      </w:r>
+      <w:r>
+        <w:t xml:space="preserve">“Steawrt”</w:t>
+      </w:r>
+      <w:r>
+        <w:t xml:space="preserve"> </w:t>
+      </w:r>
+      <w:r>
+        <w:t xml:space="preserve">- and inside Stewart, Sterling, Stephens, Steuben, Unity and Apthorp, any street or</w:t>
+      </w:r>
+      <w:r>
+        <w:t xml:space="preserve"> </w:t>
+      </w:r>
+      <w:r>
+        <w:t xml:space="preserve">town beginning apt, ste or unit.</w:t>
+      </w:r>
+      <w:r>
+        <w:t xml:space="preserve"> </w:t>
+      </w:r>
+      <w:r>
+        <w:rPr>
+          <w:rStyle w:val="VerbatimChar"/>
+        </w:rPr>
+        <w:t xml:space="preserve">geocode.parse_rule</w:t>
+      </w:r>
+      <w:r>
+        <w:t xml:space="preserve"> </w:t>
+      </w:r>
+      <w:r>
+        <w:t xml:space="preserve">has always had it right, using</w:t>
+      </w:r>
+      <w:r>
+        <w:t xml:space="preserve"> </w:t>
+      </w:r>
+      <w:r>
+        <w:rPr>
+          <w:rStyle w:val="VerbatimChar"/>
+        </w:rPr>
+        <w:t xml:space="preserve">\m...\M</w:t>
+      </w:r>
+      <w:r>
+        <w:t xml:space="preserve">.</w:t>
+      </w:r>
+    </w:p>
+    <w:p>
+      <w:pPr>
+        <w:pStyle w:val="BodyText"/>
+      </w:pPr>
+      <w:r>
+        <w:t xml:space="preserve">That is the argument for this kind of test in one line: it does not need to know the right answer.</w:t>
+      </w:r>
+      <w:r>
+        <w:t xml:space="preserve"> </w:t>
+      </w:r>
+      <w:r>
+        <w:t xml:space="preserve">An accuracy set can only find what its ground truth covers, and five regions of ground truth had</w:t>
+      </w:r>
+      <w:r>
+        <w:t xml:space="preserve"> </w:t>
+      </w:r>
+      <w:r>
+        <w:t xml:space="preserve">not covered a town beginning</w:t>
+      </w:r>
+      <w:r>
+        <w:t xml:space="preserve"> </w:t>
+      </w:r>
+      <w:r>
+        <w:t xml:space="preserve">“Ste”</w:t>
+      </w:r>
+      <w:r>
+        <w:t xml:space="preserve">. Two implementations disagreeing is evidence on its own.</w:t>
+      </w:r>
+    </w:p>
+    <w:p>
+      <w:pPr>
+        <w:pStyle w:val="BodyText"/>
+      </w:pPr>
+      <w:r>
+        <w:t xml:space="preserve">All five builds now agree across 2,286 queries.</w:t>
+      </w:r>
+    </w:p>
+    <w:bookmarkEnd w:id="25"/>
+    <w:bookmarkEnd w:id="26"/>
+    <w:bookmarkStart w:id="27" w:name="multi-state-builds"/>
+    <w:p>
+      <w:pPr>
+        <w:pStyle w:val="Heading2"/>
+      </w:pPr>
+      <w:r>
+        <w:t xml:space="preserve">6. Multi-state builds</w:t>
+      </w:r>
+    </w:p>
+    <w:p>
+      <w:pPr>
+        <w:pStyle w:val="FirstParagraph"/>
+      </w:pPr>
+      <w:r>
+        <w:t xml:space="preserve">A build may cover several states. Vermont plus New Hampshire was built through the documented</w:t>
+      </w:r>
+      <w:r>
+        <w:t xml:space="preserve"> </w:t>
+      </w:r>
+      <w:r>
+        <w:t xml:space="preserve">command, unattended: 1,074,744 raw features from two OpenStreetMap extracts appended into one</w:t>
+      </w:r>
+      <w:r>
+        <w:t xml:space="preserve"> </w:t>
+      </w:r>
+      <w:r>
+        <w:t xml:space="preserve">schema, 285,846 on the Vermont side and 121,554 on the New Hampshire side, and all sixteen known</w:t>
+      </w:r>
+      <w:r>
+        <w:t xml:space="preserve"> </w:t>
+      </w:r>
+      <w:r>
+        <w:t xml:space="preserve">answers passing on both front ends - including</w:t>
+      </w:r>
+      <w:r>
+        <w:t xml:space="preserve"> </w:t>
+      </w:r>
+      <w:r>
+        <w:t xml:space="preserve">“Burlington, Vermont”</w:t>
+      </w:r>
+      <w:r>
+        <w:t xml:space="preserve"> </w:t>
+      </w:r>
+      <w:r>
+        <w:t xml:space="preserve">giving</w:t>
+      </w:r>
+      <w:r>
+        <w:t xml:space="preserve"> </w:t>
+      </w:r>
+      <w:r>
+        <w:rPr>
+          <w:rStyle w:val="VerbatimChar"/>
+        </w:rPr>
+        <w:t xml:space="preserve">Burlington, VT, USA</w:t>
+      </w:r>
+      <w:r>
+        <w:t xml:space="preserve"> </w:t>
+      </w:r>
+      <w:r>
+        <w:t xml:space="preserve">and</w:t>
+      </w:r>
+      <w:r>
+        <w:t xml:space="preserve"> </w:t>
+      </w:r>
+      <w:r>
+        <w:t xml:space="preserve">“Concord, New Hampshire”</w:t>
+      </w:r>
+      <w:r>
+        <w:t xml:space="preserve"> </w:t>
+      </w:r>
+      <w:r>
+        <w:t xml:space="preserve">giving</w:t>
+      </w:r>
+      <w:r>
+        <w:t xml:space="preserve"> </w:t>
+      </w:r>
+      <w:r>
+        <w:rPr>
+          <w:rStyle w:val="VerbatimChar"/>
+        </w:rPr>
+        <w:t xml:space="preserve">Concord, NH, USA</w:t>
+      </w:r>
+      <w:r>
+        <w:t xml:space="preserve">, which is the thing a multi-state build</w:t>
+      </w:r>
+      <w:r>
+        <w:t xml:space="preserve"> </w:t>
+      </w:r>
+      <w:r>
+        <w:t xml:space="preserve">has to get right and a check on the town name alone would not notice.</w:t>
+      </w:r>
+    </w:p>
+    <w:p>
+      <w:pPr>
+        <w:pStyle w:val="BodyText"/>
+      </w:pPr>
+      <w:r>
+        <w:t xml:space="preserve">It found one defect the single-state builds could not: GNIS publishes a feature on a state line</w:t>
+      </w:r>
+      <w:r>
+        <w:t xml:space="preserve"> </w:t>
+      </w:r>
+      <w:r>
+        <w:t xml:space="preserve">in both states’ files with the same id, and Vermont and New Hampshire share 36 of them, all</w:t>
+      </w:r>
+      <w:r>
+        <w:t xml:space="preserve"> </w:t>
+      </w:r>
+      <w:r>
+        <w:t xml:space="preserve">brooks along the Connecticut River. The export validator refused the duplicate ids, which is how</w:t>
+      </w:r>
+      <w:r>
+        <w:t xml:space="preserve"> </w:t>
+      </w:r>
+      <w:r>
+        <w:t xml:space="preserve">it was found rather than shipped.</w:t>
+      </w:r>
+    </w:p>
+    <w:p>
+      <w:pPr>
+        <w:pStyle w:val="BodyText"/>
+      </w:pPr>
+      <w:r>
+        <w:t xml:space="preserve">Arizona plus Nevada was the second multi-state build and a much larger one, run start to finish</w:t>
+      </w:r>
+      <w:r>
+        <w:t xml:space="preserve"> </w:t>
+      </w:r>
+      <w:r>
+        <w:t xml:space="preserve">through the single documented command:</w:t>
+      </w:r>
+    </w:p>
+    <w:tbl>
+      <w:tblPr>
+        <w:tblStyle w:val="Table"/>
+        <w:tblW w:type="auto" w:w="0"/>
+        <w:tblLook w:firstRow="1" w:lastRow="0" w:firstColumn="0" w:lastColumn="0" w:noHBand="0" w:noVBand="0" w:val="0020"/>
+      </w:tblPr>
+      <w:tblGrid>
+        <w:gridCol w:w="2640"/>
+        <w:gridCol w:w="2640"/>
+        <w:gridCol w:w="2640"/>
+      </w:tblGrid>
+      <w:tr>
+        <w:trPr>
+          <w:tblHeader w:val="on"/>
+        </w:trPr>
+        <w:tc>
+          <w:tcPr/>
+          <w:p>
+            <w:pPr>
+              <w:pStyle w:val="Compact"/>
+            </w:pPr>
           </w:p>
         </w:tc>
         <w:tc>
@@ -8455,8 +8951,8 @@
         <w:t xml:space="preserve">section 11).</w:t>
       </w:r>
     </w:p>
-    <w:bookmarkEnd w:id="26"/>
-    <w:bookmarkStart w:id="27" w:name="corner-cases-across-the-fifty-states"/>
+    <w:bookmarkEnd w:id="27"/>
+    <w:bookmarkStart w:id="28" w:name="corner-cases-across-the-fifty-states"/>
     <w:p>
       <w:pPr>
         <w:pStyle w:val="Heading2"/>
@@ -8812,8 +9308,8 @@
         <w:t xml:space="preserve">accept anything. Handling it means carrying two boxes through every step.</w:t>
       </w:r>
     </w:p>
-    <w:bookmarkEnd w:id="27"/>
-    <w:bookmarkStart w:id="28" w:name="resource-requirements"/>
+    <w:bookmarkEnd w:id="28"/>
+    <w:bookmarkStart w:id="29" w:name="resource-requirements"/>
     <w:p>
       <w:pPr>
         <w:pStyle w:val="Heading2"/>
@@ -9253,8 +9749,8 @@
         <w:t xml:space="preserve">carries the full table.</w:t>
       </w:r>
     </w:p>
-    <w:bookmarkEnd w:id="28"/>
-    <w:bookmarkStart w:id="29" w:name="what-this-means-for-the-study-report"/>
+    <w:bookmarkEnd w:id="29"/>
+    <w:bookmarkStart w:id="30" w:name="what-this-means-for-the-study-report"/>
     <w:p>
       <w:pPr>
         <w:pStyle w:val="Heading2"/>
@@ -9381,8 +9877,8 @@
         <w:t xml:space="preserve">rule adds, 4,088 addresses the duplicate clustering recovers, less what the clip removes.</w:t>
       </w:r>
     </w:p>
-    <w:bookmarkEnd w:id="29"/>
-    <w:bookmarkStart w:id="30" w:name="what-is-not-done"/>
+    <w:bookmarkEnd w:id="30"/>
+    <w:bookmarkStart w:id="31" w:name="what-is-not-done"/>
     <w:p>
       <w:pPr>
         <w:pStyle w:val="Heading2"/>
@@ -9396,25 +9892,31 @@
         <w:pStyle w:val="FirstParagraph"/>
       </w:pPr>
       <w:r>
-        <w:t xml:space="preserve">Two entries that stood here in the first draft have since been closed, and the numbers they</w:t>
-      </w:r>
-      <w:r>
-        <w:t xml:space="preserve"> </w:t>
-      </w:r>
-      <w:r>
-        <w:t xml:space="preserve">carried are now in sections 4.1 and 5.4: the border margin is clipped on every source and the</w:t>
-      </w:r>
-      <w:r>
-        <w:t xml:space="preserve"> </w:t>
-      </w:r>
-      <w:r>
-        <w:t xml:space="preserve">neighbouring countries are subtracted from the buffer, and venues no longer outrank the localities</w:t>
-      </w:r>
-      <w:r>
-        <w:t xml:space="preserve"> </w:t>
-      </w:r>
-      <w:r>
-        <w:t xml:space="preserve">they are named after. What remains:</w:t>
+        <w:t xml:space="preserve">Three entries that stood here in earlier drafts have since been closed, and what they carried is</w:t>
+      </w:r>
+      <w:r>
+        <w:t xml:space="preserve"> </w:t>
+      </w:r>
+      <w:r>
+        <w:t xml:space="preserve">now in sections 4.1, 5.4 and 5.6: the border margin is clipped on every source and the</w:t>
+      </w:r>
+      <w:r>
+        <w:t xml:space="preserve"> </w:t>
+      </w:r>
+      <w:r>
+        <w:t xml:space="preserve">neighbouring countries are subtracted from the buffer, venues no longer outrank the localities</w:t>
+      </w:r>
+      <w:r>
+        <w:t xml:space="preserve"> </w:t>
+      </w:r>
+      <w:r>
+        <w:t xml:space="preserve">they are named after, and the two front ends are held to each other by a contract test. What</w:t>
+      </w:r>
+      <w:r>
+        <w:t xml:space="preserve"> </w:t>
+      </w:r>
+      <w:r>
+        <w:t xml:space="preserve">remains:</w:t>
       </w:r>
     </w:p>
     <w:p>
@@ -9430,49 +9932,31 @@
           <w:b/>
           <w:bCs/>
         </w:rPr>
-        <w:t xml:space="preserve">Two front ends hold two copies of the parser, and nothing checks they agree.</w:t>
-      </w:r>
-      <w:r>
-        <w:t xml:space="preserve"> </w:t>
-      </w:r>
-      <w:r>
-        <w:t xml:space="preserve">This has now</w:t>
-      </w:r>
-      <w:r>
-        <w:t xml:space="preserve"> </w:t>
-      </w:r>
-      <w:r>
-        <w:t xml:space="preserve">caused two escapes in one working period. A misspelled town reached the right city on the SQL</w:t>
-      </w:r>
-      <w:r>
-        <w:t xml:space="preserve"> </w:t>
-      </w:r>
-      <w:r>
-        <w:t xml:space="preserve">edge and the wrong one on FastAPI, because only the SQL half had been made state-aware; earlier,</w:t>
-      </w:r>
-      <w:r>
-        <w:t xml:space="preserve"> </w:t>
-      </w:r>
-      <w:r>
-        <w:t xml:space="preserve">a container left on a stale image served an older parser while the database served a newer one,</w:t>
-      </w:r>
-      <w:r>
-        <w:t xml:space="preserve"> </w:t>
-      </w:r>
-      <w:r>
-        <w:t xml:space="preserve">and the known answers passed anyway because they matched on a substring. A contract test that</w:t>
-      </w:r>
-      <w:r>
-        <w:t xml:space="preserve"> </w:t>
-      </w:r>
-      <w:r>
-        <w:t xml:space="preserve">puts the same queries through both and fails on disagreement is the cheapest remaining</w:t>
-      </w:r>
-      <w:r>
-        <w:t xml:space="preserve"> </w:t>
-      </w:r>
-      <w:r>
-        <w:t xml:space="preserve">improvement in this document, and the one most likely to catch the next mistake.</w:t>
+        <w:t xml:space="preserve">Typo and variant matching at the largest scale.</w:t>
+      </w:r>
+      <w:r>
+        <w:t xml:space="preserve"> </w:t>
+      </w:r>
+      <w:r>
+        <w:t xml:space="preserve">Texas plus Louisiana plus Arkansas scores</w:t>
+      </w:r>
+      <w:r>
+        <w:t xml:space="preserve"> </w:t>
+      </w:r>
+      <w:r>
+        <w:t xml:space="preserve">75% on towns and venues against 82-96% elsewhere, and the obvious explanation - ambiguity across</w:t>
+      </w:r>
+      <w:r>
+        <w:t xml:space="preserve"> </w:t>
+      </w:r>
+      <w:r>
+        <w:t xml:space="preserve">three states - accounts for 2 of 13 failing cases when tested. The cause of the rest has not</w:t>
+      </w:r>
+      <w:r>
+        <w:t xml:space="preserve"> </w:t>
+      </w:r>
+      <w:r>
+        <w:t xml:space="preserve">been found. See section 5.5.</w:t>
       </w:r>
     </w:p>
     <w:p>
@@ -9488,31 +9972,37 @@
           <w:b/>
           <w:bCs/>
         </w:rPr>
-        <w:t xml:space="preserve">Typo and variant matching at the largest scale.</w:t>
-      </w:r>
-      <w:r>
-        <w:t xml:space="preserve"> </w:t>
-      </w:r>
-      <w:r>
-        <w:t xml:space="preserve">Texas plus Louisiana plus Arkansas scores</w:t>
-      </w:r>
-      <w:r>
-        <w:t xml:space="preserve"> </w:t>
-      </w:r>
-      <w:r>
-        <w:t xml:space="preserve">75% on towns and venues against 82-96% elsewhere, and the obvious explanation - ambiguity across</w:t>
-      </w:r>
-      <w:r>
-        <w:t xml:space="preserve"> </w:t>
-      </w:r>
-      <w:r>
-        <w:t xml:space="preserve">three states - accounts for 2 of 13 failing cases when tested. The cause of the rest has not</w:t>
-      </w:r>
-      <w:r>
-        <w:t xml:space="preserve"> </w:t>
-      </w:r>
-      <w:r>
-        <w:t xml:space="preserve">been found. See section 5.5.</w:t>
+        <w:t xml:space="preserve">The Who’s on First ancestry gap.</w:t>
+      </w:r>
+      <w:r>
+        <w:t xml:space="preserve"> </w:t>
+      </w:r>
+      <w:r>
+        <w:t xml:space="preserve">Some places carry no region ancestor and are dropped: 1 in</w:t>
+      </w:r>
+      <w:r>
+        <w:t xml:space="preserve"> </w:t>
+      </w:r>
+      <w:r>
+        <w:t xml:space="preserve">Maine, 5 in New York, 62 in Nevada, 72 in Arizona. The loss falls on unincorporated and tribal</w:t>
+      </w:r>
+      <w:r>
+        <w:t xml:space="preserve"> </w:t>
+      </w:r>
+      <w:r>
+        <w:t xml:space="preserve">communities - Chutum Vaya, Allenville, Cibecue Creek, Jarbidge - which is the population least</w:t>
+      </w:r>
+      <w:r>
+        <w:t xml:space="preserve"> </w:t>
+      </w:r>
+      <w:r>
+        <w:t xml:space="preserve">well served by every other geocoder too. A point-in-polygon fallback against the region geometry</w:t>
+      </w:r>
+      <w:r>
+        <w:t xml:space="preserve"> </w:t>
+      </w:r>
+      <w:r>
+        <w:t xml:space="preserve">would recover them.</w:t>
       </w:r>
     </w:p>
     <w:p>
@@ -9528,37 +10018,19 @@
           <w:b/>
           <w:bCs/>
         </w:rPr>
-        <w:t xml:space="preserve">The Who’s on First ancestry gap.</w:t>
-      </w:r>
-      <w:r>
-        <w:t xml:space="preserve"> </w:t>
-      </w:r>
-      <w:r>
-        <w:t xml:space="preserve">Some places carry no region ancestor and are dropped: 1 in</w:t>
-      </w:r>
-      <w:r>
-        <w:t xml:space="preserve"> </w:t>
-      </w:r>
-      <w:r>
-        <w:t xml:space="preserve">Maine, 5 in New York, 62 in Nevada, 72 in Arizona. The loss falls on unincorporated and tribal</w:t>
-      </w:r>
-      <w:r>
-        <w:t xml:space="preserve"> </w:t>
-      </w:r>
-      <w:r>
-        <w:t xml:space="preserve">communities - Chutum Vaya, Allenville, Cibecue Creek, Jarbidge - which is the population least</w:t>
-      </w:r>
-      <w:r>
-        <w:t xml:space="preserve"> </w:t>
-      </w:r>
-      <w:r>
-        <w:t xml:space="preserve">well served by every other geocoder too. A point-in-polygon fallback against the region geometry</w:t>
-      </w:r>
-      <w:r>
-        <w:t xml:space="preserve"> </w:t>
-      </w:r>
-      <w:r>
-        <w:t xml:space="preserve">would recover them.</w:t>
+        <w:t xml:space="preserve">Query-time tie-breaking</w:t>
+      </w:r>
+      <w:r>
+        <w:t xml:space="preserve"> </w:t>
+      </w:r>
+      <w:r>
+        <w:t xml:space="preserve">is still by physical row order, worth about one case of accuracy</w:t>
+      </w:r>
+      <w:r>
+        <w:t xml:space="preserve"> </w:t>
+      </w:r>
+      <w:r>
+        <w:t xml:space="preserve">noise between builds.</w:t>
       </w:r>
     </w:p>
     <w:p>
@@ -9574,19 +10046,13 @@
           <w:b/>
           <w:bCs/>
         </w:rPr>
-        <w:t xml:space="preserve">Query-time tie-breaking</w:t>
-      </w:r>
-      <w:r>
-        <w:t xml:space="preserve"> </w:t>
-      </w:r>
-      <w:r>
-        <w:t xml:space="preserve">is still by physical row order, worth about one case of accuracy</w:t>
-      </w:r>
-      <w:r>
-        <w:t xml:space="preserve"> </w:t>
-      </w:r>
-      <w:r>
-        <w:t xml:space="preserve">noise between builds.</w:t>
+        <w:t xml:space="preserve">Alaska</w:t>
+      </w:r>
+      <w:r>
+        <w:t xml:space="preserve"> </w:t>
+      </w:r>
+      <w:r>
+        <w:t xml:space="preserve">is refused rather than handled, its bounding box spanning the antimeridian.</w:t>
       </w:r>
     </w:p>
     <w:p>
@@ -9602,13 +10068,25 @@
           <w:b/>
           <w:bCs/>
         </w:rPr>
-        <w:t xml:space="preserve">Alaska</w:t>
-      </w:r>
-      <w:r>
-        <w:t xml:space="preserve"> </w:t>
-      </w:r>
-      <w:r>
-        <w:t xml:space="preserve">is refused rather than handled, its bounding box spanning the antimeridian.</w:t>
+        <w:t xml:space="preserve">A bounding-box build</w:t>
+      </w:r>
+      <w:r>
+        <w:t xml:space="preserve"> </w:t>
+      </w:r>
+      <w:r>
+        <w:t xml:space="preserve">- part of a state, or the adjoining parts of several - would scale</w:t>
+      </w:r>
+      <w:r>
+        <w:t xml:space="preserve"> </w:t>
+      </w:r>
+      <w:r>
+        <w:t xml:space="preserve">every cost down together. The plumbing is already threaded, since every step reads the build’s</w:t>
+      </w:r>
+      <w:r>
+        <w:t xml:space="preserve"> </w:t>
+      </w:r>
+      <w:r>
+        <w:t xml:space="preserve">box.</w:t>
       </w:r>
     </w:p>
     <w:p>
@@ -9624,25 +10102,13 @@
           <w:b/>
           <w:bCs/>
         </w:rPr>
-        <w:t xml:space="preserve">A bounding-box build</w:t>
-      </w:r>
-      <w:r>
-        <w:t xml:space="preserve"> </w:t>
-      </w:r>
-      <w:r>
-        <w:t xml:space="preserve">- part of a state, or the adjoining parts of several - would scale</w:t>
-      </w:r>
-      <w:r>
-        <w:t xml:space="preserve"> </w:t>
-      </w:r>
-      <w:r>
-        <w:t xml:space="preserve">every cost down together. The plumbing is already threaded, since every step reads the build’s</w:t>
-      </w:r>
-      <w:r>
-        <w:t xml:space="preserve"> </w:t>
-      </w:r>
-      <w:r>
-        <w:t xml:space="preserve">box.</w:t>
+        <w:t xml:space="preserve">Container images</w:t>
+      </w:r>
+      <w:r>
+        <w:t xml:space="preserve"> </w:t>
+      </w:r>
+      <w:r>
+        <w:t xml:space="preserve">remain designed and unpublished.</w:t>
       </w:r>
     </w:p>
     <w:p>
@@ -9658,28 +10124,6 @@
           <w:b/>
           <w:bCs/>
         </w:rPr>
-        <w:t xml:space="preserve">Container images</w:t>
-      </w:r>
-      <w:r>
-        <w:t xml:space="preserve"> </w:t>
-      </w:r>
-      <w:r>
-        <w:t xml:space="preserve">remain designed and unpublished.</w:t>
-      </w:r>
-    </w:p>
-    <w:p>
-      <w:pPr>
-        <w:pStyle w:val="Compact"/>
-        <w:numPr>
-          <w:ilvl w:val="0"/>
-          <w:numId w:val="1006"/>
-        </w:numPr>
-      </w:pPr>
-      <w:r>
-        <w:rPr>
-          <w:b/>
-          <w:bCs/>
-        </w:rPr>
         <w:t xml:space="preserve">Only Maine has been load-tested.</w:t>
       </w:r>
       <w:r>
@@ -9727,7 +10171,7 @@
         <w:t xml:space="preserve">at which more regions stop paying for themselves.</w:t>
       </w:r>
     </w:p>
-    <w:bookmarkEnd w:id="30"/>
+    <w:bookmarkEnd w:id="31"/>
     <w:sectPr>
       <w:footnotePr>
         <w:numRestart w:val="eachSect"/>

</xml_diff>